<commit_message>
Added Speaking and Presenting roles for the Townhall
</commit_message>
<xml_diff>
--- a/PlanforGameDay-Group8-Revised.docx
+++ b/PlanforGameDay-Group8-Revised.docx
@@ -81,6 +81,470 @@
         </w:rPr>
         <w:t>With four teammates (Raja, Arun, Aubin, Sudhaman) — one primary presenter anchors every cycle for consistency, one demo driver runs the live agent interaction, and two handle Q&amp;A by domain (architecture vs. agent behavior, for example).</w:t>
       </w:r>
+      <w:r>
+        <w:rPr>
+          <w:sz w:val="24"/>
+          <w:szCs w:val="24"/>
+        </w:rPr>
+        <w:br/>
+      </w:r>
+      <w:r>
+        <w:rPr>
+          <w:sz w:val="24"/>
+          <w:szCs w:val="24"/>
+        </w:rPr>
+        <w:br/>
+      </w:r>
+    </w:p>
+    <w:tbl>
+      <w:tblPr>
+        <w:tblStyle w:val="GridTable2-Accent3"/>
+        <w:tblW w:w="3900" w:type="dxa"/>
+        <w:tblLook w:val="04A0" w:firstRow="1" w:lastRow="0" w:firstColumn="1" w:lastColumn="0" w:noHBand="0" w:noVBand="1"/>
+      </w:tblPr>
+      <w:tblGrid>
+        <w:gridCol w:w="1300"/>
+        <w:gridCol w:w="1300"/>
+        <w:gridCol w:w="1300"/>
+      </w:tblGrid>
+      <w:tr>
+        <w:trPr>
+          <w:cnfStyle w:val="100000000000" w:firstRow="1" w:lastRow="0" w:firstColumn="0" w:lastColumn="0" w:oddVBand="0" w:evenVBand="0" w:oddHBand="0" w:evenHBand="0" w:firstRowFirstColumn="0" w:firstRowLastColumn="0" w:lastRowFirstColumn="0" w:lastRowLastColumn="0"/>
+          <w:trHeight w:val="320"/>
+        </w:trPr>
+        <w:tc>
+          <w:tcPr>
+            <w:cnfStyle w:val="001000000000" w:firstRow="0" w:lastRow="0" w:firstColumn="1" w:lastColumn="0" w:oddVBand="0" w:evenVBand="0" w:oddHBand="0" w:evenHBand="0" w:firstRowFirstColumn="0" w:firstRowLastColumn="0" w:lastRowFirstColumn="0" w:lastRowLastColumn="0"/>
+            <w:tcW w:w="1300" w:type="dxa"/>
+            <w:noWrap/>
+            <w:hideMark/>
+          </w:tcPr>
+          <w:p>
+            <w:pPr>
+              <w:rPr>
+                <w:rFonts w:ascii="Aptos Narrow" w:hAnsi="Aptos Narrow"/>
+                <w:color w:val="000000"/>
+                <w:sz w:val="24"/>
+                <w:szCs w:val="24"/>
+              </w:rPr>
+            </w:pPr>
+            <w:r>
+              <w:rPr>
+                <w:rFonts w:ascii="Aptos Narrow" w:hAnsi="Aptos Narrow"/>
+                <w:color w:val="000000"/>
+                <w:sz w:val="24"/>
+                <w:szCs w:val="24"/>
+              </w:rPr>
+              <w:t>Presenter</w:t>
+            </w:r>
+          </w:p>
+        </w:tc>
+        <w:tc>
+          <w:tcPr>
+            <w:tcW w:w="1300" w:type="dxa"/>
+            <w:noWrap/>
+            <w:hideMark/>
+          </w:tcPr>
+          <w:p>
+            <w:pPr>
+              <w:cnfStyle w:val="100000000000" w:firstRow="1" w:lastRow="0" w:firstColumn="0" w:lastColumn="0" w:oddVBand="0" w:evenVBand="0" w:oddHBand="0" w:evenHBand="0" w:firstRowFirstColumn="0" w:firstRowLastColumn="0" w:lastRowFirstColumn="0" w:lastRowLastColumn="0"/>
+              <w:rPr>
+                <w:rFonts w:ascii="Aptos Narrow" w:hAnsi="Aptos Narrow"/>
+                <w:color w:val="000000"/>
+                <w:sz w:val="24"/>
+                <w:szCs w:val="24"/>
+              </w:rPr>
+            </w:pPr>
+            <w:r>
+              <w:rPr>
+                <w:rFonts w:ascii="Aptos Narrow" w:hAnsi="Aptos Narrow"/>
+                <w:color w:val="000000"/>
+                <w:sz w:val="24"/>
+                <w:szCs w:val="24"/>
+              </w:rPr>
+              <w:t>Demo</w:t>
+            </w:r>
+          </w:p>
+        </w:tc>
+        <w:tc>
+          <w:tcPr>
+            <w:tcW w:w="1300" w:type="dxa"/>
+            <w:noWrap/>
+            <w:hideMark/>
+          </w:tcPr>
+          <w:p>
+            <w:pPr>
+              <w:cnfStyle w:val="100000000000" w:firstRow="1" w:lastRow="0" w:firstColumn="0" w:lastColumn="0" w:oddVBand="0" w:evenVBand="0" w:oddHBand="0" w:evenHBand="0" w:firstRowFirstColumn="0" w:firstRowLastColumn="0" w:lastRowFirstColumn="0" w:lastRowLastColumn="0"/>
+              <w:rPr>
+                <w:rFonts w:ascii="Aptos Narrow" w:hAnsi="Aptos Narrow"/>
+                <w:color w:val="000000"/>
+                <w:sz w:val="24"/>
+                <w:szCs w:val="24"/>
+              </w:rPr>
+            </w:pPr>
+            <w:r>
+              <w:rPr>
+                <w:rFonts w:ascii="Aptos Narrow" w:hAnsi="Aptos Narrow"/>
+                <w:color w:val="000000"/>
+                <w:sz w:val="24"/>
+                <w:szCs w:val="24"/>
+              </w:rPr>
+              <w:t>Slot</w:t>
+            </w:r>
+          </w:p>
+        </w:tc>
+      </w:tr>
+      <w:tr>
+        <w:trPr>
+          <w:cnfStyle w:val="000000100000" w:firstRow="0" w:lastRow="0" w:firstColumn="0" w:lastColumn="0" w:oddVBand="0" w:evenVBand="0" w:oddHBand="1" w:evenHBand="0" w:firstRowFirstColumn="0" w:firstRowLastColumn="0" w:lastRowFirstColumn="0" w:lastRowLastColumn="0"/>
+          <w:trHeight w:val="320"/>
+        </w:trPr>
+        <w:tc>
+          <w:tcPr>
+            <w:cnfStyle w:val="001000000000" w:firstRow="0" w:lastRow="0" w:firstColumn="1" w:lastColumn="0" w:oddVBand="0" w:evenVBand="0" w:oddHBand="0" w:evenHBand="0" w:firstRowFirstColumn="0" w:firstRowLastColumn="0" w:lastRowFirstColumn="0" w:lastRowLastColumn="0"/>
+            <w:tcW w:w="1300" w:type="dxa"/>
+            <w:noWrap/>
+            <w:hideMark/>
+          </w:tcPr>
+          <w:p>
+            <w:pPr>
+              <w:rPr>
+                <w:rFonts w:ascii="Aptos Narrow" w:hAnsi="Aptos Narrow"/>
+                <w:color w:val="000000"/>
+                <w:sz w:val="24"/>
+                <w:szCs w:val="24"/>
+              </w:rPr>
+            </w:pPr>
+            <w:r>
+              <w:rPr>
+                <w:rFonts w:ascii="Aptos Narrow" w:hAnsi="Aptos Narrow"/>
+                <w:color w:val="000000"/>
+                <w:sz w:val="24"/>
+                <w:szCs w:val="24"/>
+              </w:rPr>
+              <w:t>Sudhaman</w:t>
+            </w:r>
+          </w:p>
+        </w:tc>
+        <w:tc>
+          <w:tcPr>
+            <w:tcW w:w="1300" w:type="dxa"/>
+            <w:noWrap/>
+            <w:hideMark/>
+          </w:tcPr>
+          <w:p>
+            <w:pPr>
+              <w:cnfStyle w:val="000000100000" w:firstRow="0" w:lastRow="0" w:firstColumn="0" w:lastColumn="0" w:oddVBand="0" w:evenVBand="0" w:oddHBand="1" w:evenHBand="0" w:firstRowFirstColumn="0" w:firstRowLastColumn="0" w:lastRowFirstColumn="0" w:lastRowLastColumn="0"/>
+              <w:rPr>
+                <w:rFonts w:ascii="Aptos Narrow" w:hAnsi="Aptos Narrow"/>
+                <w:color w:val="000000"/>
+                <w:sz w:val="24"/>
+                <w:szCs w:val="24"/>
+              </w:rPr>
+            </w:pPr>
+            <w:r>
+              <w:rPr>
+                <w:rFonts w:ascii="Aptos Narrow" w:hAnsi="Aptos Narrow"/>
+                <w:color w:val="000000"/>
+                <w:sz w:val="24"/>
+                <w:szCs w:val="24"/>
+              </w:rPr>
+              <w:t>Raja</w:t>
+            </w:r>
+          </w:p>
+        </w:tc>
+        <w:tc>
+          <w:tcPr>
+            <w:tcW w:w="1300" w:type="dxa"/>
+            <w:noWrap/>
+            <w:hideMark/>
+          </w:tcPr>
+          <w:p>
+            <w:pPr>
+              <w:cnfStyle w:val="000000100000" w:firstRow="0" w:lastRow="0" w:firstColumn="0" w:lastColumn="0" w:oddVBand="0" w:evenVBand="0" w:oddHBand="1" w:evenHBand="0" w:firstRowFirstColumn="0" w:firstRowLastColumn="0" w:lastRowFirstColumn="0" w:lastRowLastColumn="0"/>
+              <w:rPr>
+                <w:rFonts w:ascii="Aptos Narrow" w:hAnsi="Aptos Narrow"/>
+                <w:color w:val="000000"/>
+                <w:sz w:val="24"/>
+                <w:szCs w:val="24"/>
+              </w:rPr>
+            </w:pPr>
+            <w:r>
+              <w:rPr>
+                <w:rFonts w:ascii="Aptos Narrow" w:hAnsi="Aptos Narrow"/>
+                <w:color w:val="000000"/>
+                <w:sz w:val="24"/>
+                <w:szCs w:val="24"/>
+              </w:rPr>
+              <w:t>Slot 1</w:t>
+            </w:r>
+          </w:p>
+        </w:tc>
+      </w:tr>
+      <w:tr>
+        <w:trPr>
+          <w:trHeight w:val="320"/>
+        </w:trPr>
+        <w:tc>
+          <w:tcPr>
+            <w:cnfStyle w:val="001000000000" w:firstRow="0" w:lastRow="0" w:firstColumn="1" w:lastColumn="0" w:oddVBand="0" w:evenVBand="0" w:oddHBand="0" w:evenHBand="0" w:firstRowFirstColumn="0" w:firstRowLastColumn="0" w:lastRowFirstColumn="0" w:lastRowLastColumn="0"/>
+            <w:tcW w:w="1300" w:type="dxa"/>
+            <w:noWrap/>
+            <w:hideMark/>
+          </w:tcPr>
+          <w:p>
+            <w:pPr>
+              <w:rPr>
+                <w:rFonts w:ascii="Aptos Narrow" w:hAnsi="Aptos Narrow"/>
+                <w:color w:val="000000"/>
+                <w:sz w:val="24"/>
+                <w:szCs w:val="24"/>
+              </w:rPr>
+            </w:pPr>
+            <w:r>
+              <w:rPr>
+                <w:rFonts w:ascii="Aptos Narrow" w:hAnsi="Aptos Narrow"/>
+                <w:color w:val="000000"/>
+                <w:sz w:val="24"/>
+                <w:szCs w:val="24"/>
+              </w:rPr>
+              <w:t>Aubin</w:t>
+            </w:r>
+          </w:p>
+        </w:tc>
+        <w:tc>
+          <w:tcPr>
+            <w:tcW w:w="1300" w:type="dxa"/>
+            <w:noWrap/>
+            <w:hideMark/>
+          </w:tcPr>
+          <w:p>
+            <w:pPr>
+              <w:cnfStyle w:val="000000000000" w:firstRow="0" w:lastRow="0" w:firstColumn="0" w:lastColumn="0" w:oddVBand="0" w:evenVBand="0" w:oddHBand="0" w:evenHBand="0" w:firstRowFirstColumn="0" w:firstRowLastColumn="0" w:lastRowFirstColumn="0" w:lastRowLastColumn="0"/>
+              <w:rPr>
+                <w:rFonts w:ascii="Aptos Narrow" w:hAnsi="Aptos Narrow"/>
+                <w:color w:val="000000"/>
+                <w:sz w:val="24"/>
+                <w:szCs w:val="24"/>
+              </w:rPr>
+            </w:pPr>
+            <w:r>
+              <w:rPr>
+                <w:rFonts w:ascii="Aptos Narrow" w:hAnsi="Aptos Narrow"/>
+                <w:color w:val="000000"/>
+                <w:sz w:val="24"/>
+                <w:szCs w:val="24"/>
+              </w:rPr>
+              <w:t>Arun</w:t>
+            </w:r>
+          </w:p>
+        </w:tc>
+        <w:tc>
+          <w:tcPr>
+            <w:tcW w:w="1300" w:type="dxa"/>
+            <w:noWrap/>
+            <w:hideMark/>
+          </w:tcPr>
+          <w:p>
+            <w:pPr>
+              <w:cnfStyle w:val="000000000000" w:firstRow="0" w:lastRow="0" w:firstColumn="0" w:lastColumn="0" w:oddVBand="0" w:evenVBand="0" w:oddHBand="0" w:evenHBand="0" w:firstRowFirstColumn="0" w:firstRowLastColumn="0" w:lastRowFirstColumn="0" w:lastRowLastColumn="0"/>
+              <w:rPr>
+                <w:rFonts w:ascii="Aptos Narrow" w:hAnsi="Aptos Narrow"/>
+                <w:color w:val="000000"/>
+                <w:sz w:val="24"/>
+                <w:szCs w:val="24"/>
+              </w:rPr>
+            </w:pPr>
+            <w:r>
+              <w:rPr>
+                <w:rFonts w:ascii="Aptos Narrow" w:hAnsi="Aptos Narrow"/>
+                <w:color w:val="000000"/>
+                <w:sz w:val="24"/>
+                <w:szCs w:val="24"/>
+              </w:rPr>
+              <w:t>Slot 2</w:t>
+            </w:r>
+          </w:p>
+        </w:tc>
+      </w:tr>
+      <w:tr>
+        <w:trPr>
+          <w:cnfStyle w:val="000000100000" w:firstRow="0" w:lastRow="0" w:firstColumn="0" w:lastColumn="0" w:oddVBand="0" w:evenVBand="0" w:oddHBand="1" w:evenHBand="0" w:firstRowFirstColumn="0" w:firstRowLastColumn="0" w:lastRowFirstColumn="0" w:lastRowLastColumn="0"/>
+          <w:trHeight w:val="320"/>
+        </w:trPr>
+        <w:tc>
+          <w:tcPr>
+            <w:cnfStyle w:val="001000000000" w:firstRow="0" w:lastRow="0" w:firstColumn="1" w:lastColumn="0" w:oddVBand="0" w:evenVBand="0" w:oddHBand="0" w:evenHBand="0" w:firstRowFirstColumn="0" w:firstRowLastColumn="0" w:lastRowFirstColumn="0" w:lastRowLastColumn="0"/>
+            <w:tcW w:w="1300" w:type="dxa"/>
+            <w:noWrap/>
+            <w:hideMark/>
+          </w:tcPr>
+          <w:p>
+            <w:pPr>
+              <w:rPr>
+                <w:rFonts w:ascii="Aptos Narrow" w:hAnsi="Aptos Narrow"/>
+                <w:color w:val="000000"/>
+                <w:sz w:val="24"/>
+                <w:szCs w:val="24"/>
+              </w:rPr>
+            </w:pPr>
+            <w:r>
+              <w:rPr>
+                <w:rFonts w:ascii="Aptos Narrow" w:hAnsi="Aptos Narrow"/>
+                <w:color w:val="000000"/>
+                <w:sz w:val="24"/>
+                <w:szCs w:val="24"/>
+              </w:rPr>
+              <w:t>Raja</w:t>
+            </w:r>
+          </w:p>
+        </w:tc>
+        <w:tc>
+          <w:tcPr>
+            <w:tcW w:w="1300" w:type="dxa"/>
+            <w:noWrap/>
+            <w:hideMark/>
+          </w:tcPr>
+          <w:p>
+            <w:pPr>
+              <w:cnfStyle w:val="000000100000" w:firstRow="0" w:lastRow="0" w:firstColumn="0" w:lastColumn="0" w:oddVBand="0" w:evenVBand="0" w:oddHBand="1" w:evenHBand="0" w:firstRowFirstColumn="0" w:firstRowLastColumn="0" w:lastRowFirstColumn="0" w:lastRowLastColumn="0"/>
+              <w:rPr>
+                <w:rFonts w:ascii="Aptos Narrow" w:hAnsi="Aptos Narrow"/>
+                <w:color w:val="000000"/>
+                <w:sz w:val="24"/>
+                <w:szCs w:val="24"/>
+              </w:rPr>
+            </w:pPr>
+            <w:r>
+              <w:rPr>
+                <w:rFonts w:ascii="Aptos Narrow" w:hAnsi="Aptos Narrow"/>
+                <w:color w:val="000000"/>
+                <w:sz w:val="24"/>
+                <w:szCs w:val="24"/>
+              </w:rPr>
+              <w:t>Aubin</w:t>
+            </w:r>
+          </w:p>
+        </w:tc>
+        <w:tc>
+          <w:tcPr>
+            <w:tcW w:w="1300" w:type="dxa"/>
+            <w:noWrap/>
+            <w:hideMark/>
+          </w:tcPr>
+          <w:p>
+            <w:pPr>
+              <w:cnfStyle w:val="000000100000" w:firstRow="0" w:lastRow="0" w:firstColumn="0" w:lastColumn="0" w:oddVBand="0" w:evenVBand="0" w:oddHBand="1" w:evenHBand="0" w:firstRowFirstColumn="0" w:firstRowLastColumn="0" w:lastRowFirstColumn="0" w:lastRowLastColumn="0"/>
+              <w:rPr>
+                <w:rFonts w:ascii="Aptos Narrow" w:hAnsi="Aptos Narrow"/>
+                <w:color w:val="000000"/>
+                <w:sz w:val="24"/>
+                <w:szCs w:val="24"/>
+              </w:rPr>
+            </w:pPr>
+            <w:r>
+              <w:rPr>
+                <w:rFonts w:ascii="Aptos Narrow" w:hAnsi="Aptos Narrow"/>
+                <w:color w:val="000000"/>
+                <w:sz w:val="24"/>
+                <w:szCs w:val="24"/>
+              </w:rPr>
+              <w:t>Slot 3</w:t>
+            </w:r>
+          </w:p>
+        </w:tc>
+      </w:tr>
+      <w:tr>
+        <w:trPr>
+          <w:trHeight w:val="320"/>
+        </w:trPr>
+        <w:tc>
+          <w:tcPr>
+            <w:cnfStyle w:val="001000000000" w:firstRow="0" w:lastRow="0" w:firstColumn="1" w:lastColumn="0" w:oddVBand="0" w:evenVBand="0" w:oddHBand="0" w:evenHBand="0" w:firstRowFirstColumn="0" w:firstRowLastColumn="0" w:lastRowFirstColumn="0" w:lastRowLastColumn="0"/>
+            <w:tcW w:w="1300" w:type="dxa"/>
+            <w:noWrap/>
+            <w:hideMark/>
+          </w:tcPr>
+          <w:p>
+            <w:pPr>
+              <w:rPr>
+                <w:rFonts w:ascii="Aptos Narrow" w:hAnsi="Aptos Narrow"/>
+                <w:color w:val="000000"/>
+                <w:sz w:val="24"/>
+                <w:szCs w:val="24"/>
+              </w:rPr>
+            </w:pPr>
+            <w:r>
+              <w:rPr>
+                <w:rFonts w:ascii="Aptos Narrow" w:hAnsi="Aptos Narrow"/>
+                <w:color w:val="000000"/>
+                <w:sz w:val="24"/>
+                <w:szCs w:val="24"/>
+              </w:rPr>
+              <w:t>Raja</w:t>
+            </w:r>
+          </w:p>
+        </w:tc>
+        <w:tc>
+          <w:tcPr>
+            <w:tcW w:w="1300" w:type="dxa"/>
+            <w:noWrap/>
+            <w:hideMark/>
+          </w:tcPr>
+          <w:p>
+            <w:pPr>
+              <w:cnfStyle w:val="000000000000" w:firstRow="0" w:lastRow="0" w:firstColumn="0" w:lastColumn="0" w:oddVBand="0" w:evenVBand="0" w:oddHBand="0" w:evenHBand="0" w:firstRowFirstColumn="0" w:firstRowLastColumn="0" w:lastRowFirstColumn="0" w:lastRowLastColumn="0"/>
+              <w:rPr>
+                <w:rFonts w:ascii="Aptos Narrow" w:hAnsi="Aptos Narrow"/>
+                <w:color w:val="000000"/>
+                <w:sz w:val="24"/>
+                <w:szCs w:val="24"/>
+              </w:rPr>
+            </w:pPr>
+            <w:r>
+              <w:rPr>
+                <w:rFonts w:ascii="Aptos Narrow" w:hAnsi="Aptos Narrow"/>
+                <w:color w:val="000000"/>
+                <w:sz w:val="24"/>
+                <w:szCs w:val="24"/>
+              </w:rPr>
+              <w:t>Sudhaman</w:t>
+            </w:r>
+          </w:p>
+        </w:tc>
+        <w:tc>
+          <w:tcPr>
+            <w:tcW w:w="1300" w:type="dxa"/>
+            <w:noWrap/>
+            <w:hideMark/>
+          </w:tcPr>
+          <w:p>
+            <w:pPr>
+              <w:cnfStyle w:val="000000000000" w:firstRow="0" w:lastRow="0" w:firstColumn="0" w:lastColumn="0" w:oddVBand="0" w:evenVBand="0" w:oddHBand="0" w:evenHBand="0" w:firstRowFirstColumn="0" w:firstRowLastColumn="0" w:lastRowFirstColumn="0" w:lastRowLastColumn="0"/>
+              <w:rPr>
+                <w:rFonts w:ascii="Aptos Narrow" w:hAnsi="Aptos Narrow"/>
+                <w:color w:val="000000"/>
+                <w:sz w:val="24"/>
+                <w:szCs w:val="24"/>
+              </w:rPr>
+            </w:pPr>
+            <w:r>
+              <w:rPr>
+                <w:rFonts w:ascii="Aptos Narrow" w:hAnsi="Aptos Narrow"/>
+                <w:color w:val="000000"/>
+                <w:sz w:val="24"/>
+                <w:szCs w:val="24"/>
+              </w:rPr>
+              <w:t>Slot 4</w:t>
+            </w:r>
+          </w:p>
+        </w:tc>
+      </w:tr>
+    </w:tbl>
+    <w:p>
+      <w:pPr>
+        <w:spacing w:after="80"/>
+      </w:pPr>
     </w:p>
     <w:p>
       <w:pPr>
@@ -234,7 +698,15 @@
           <w:sz w:val="24"/>
           <w:szCs w:val="24"/>
         </w:rPr>
-        <w:t xml:space="preserve"> + React stack + how we deployed to GCP (Cloud Run) with the agent orchestration shown clearly. Keep it to 2 minutes and leave time for Q&amp;A.</w:t>
+        <w:t xml:space="preserve"> + React stack + how we deployed to GCP (Cloud </w:t>
+      </w:r>
+      <w:r>
+        <w:rPr>
+          <w:sz w:val="24"/>
+          <w:szCs w:val="24"/>
+        </w:rPr>
+        <w:lastRenderedPageBreak/>
+        <w:t>Run) with the agent orchestration shown clearly. Keep it to 2 minutes and leave time for Q&amp;A.</w:t>
       </w:r>
     </w:p>
     <w:p>
@@ -318,7 +790,6 @@
           <w:sz w:val="30"/>
           <w:szCs w:val="30"/>
         </w:rPr>
-        <w:lastRenderedPageBreak/>
         <w:t>Demo fallback &amp; reliability plan</w:t>
       </w:r>
     </w:p>
@@ -572,6 +1043,7 @@
           <w:sz w:val="24"/>
           <w:szCs w:val="24"/>
         </w:rPr>
+        <w:lastRenderedPageBreak/>
         <w:t>“For folks just joining — we’re building a multi-agent system for B2B telecom sales, you just missed the live demo, we have a recording linked via the QR code on screen, and we’re now in Q&amp;A.”</w:t>
       </w:r>
     </w:p>
@@ -662,7 +1134,6 @@
           <w:sz w:val="26"/>
           <w:szCs w:val="26"/>
         </w:rPr>
-        <w:lastRenderedPageBreak/>
         <w:t>The 30-second pitch (use this when someone walks up)</w:t>
       </w:r>
     </w:p>
@@ -937,6 +1408,7 @@
           <w:sz w:val="26"/>
           <w:szCs w:val="26"/>
         </w:rPr>
+        <w:lastRenderedPageBreak/>
         <w:t>Evaluation — how do you know it works?</w:t>
       </w:r>
     </w:p>
@@ -1109,140 +1581,147 @@
           <w:sz w:val="26"/>
           <w:szCs w:val="26"/>
         </w:rPr>
+        <w:t>PII concerns</w:t>
+      </w:r>
+    </w:p>
+    <w:p>
+      <w:pPr>
+        <w:pStyle w:val="ListParagraph"/>
+        <w:numPr>
+          <w:ilvl w:val="0"/>
+          <w:numId w:val="2"/>
+        </w:numPr>
+        <w:spacing w:after="60"/>
+      </w:pPr>
+      <w:r>
+        <w:rPr>
+          <w:b/>
+          <w:bCs/>
+          <w:sz w:val="24"/>
+          <w:szCs w:val="24"/>
+        </w:rPr>
+        <w:t>What PII does a production deployment handle?</w:t>
+      </w:r>
+      <w:r>
+        <w:rPr>
+          <w:sz w:val="24"/>
+          <w:szCs w:val="24"/>
+        </w:rPr>
+        <w:t xml:space="preserve"> Business name, contact details (name, email, phone), service address, payment authorization data (credit check inputs, payment tokens), and conversation history. In the demo environment, all data is synthetic. In production, each of these categories requires a distinct handling regime.</w:t>
+      </w:r>
+    </w:p>
+    <w:p>
+      <w:pPr>
+        <w:pStyle w:val="ListParagraph"/>
+        <w:numPr>
+          <w:ilvl w:val="0"/>
+          <w:numId w:val="2"/>
+        </w:numPr>
+        <w:spacing w:after="60"/>
+      </w:pPr>
+      <w:r>
+        <w:rPr>
+          <w:b/>
+          <w:bCs/>
+          <w:sz w:val="24"/>
+          <w:szCs w:val="24"/>
+        </w:rPr>
+        <w:t>LLM training opt-out — the most critical concern.</w:t>
+      </w:r>
+      <w:r>
+        <w:rPr>
+          <w:sz w:val="24"/>
+          <w:szCs w:val="24"/>
+        </w:rPr>
+        <w:t xml:space="preserve"> By default, consumer-tier LLM APIs (including Gemini) may use API inputs to improve models. In a production Comcast deployment this is a hard no. Mitigation options in priority order: (1) use Google’s Vertex AI rather than the Gemini Developer API — Vertex AI API calls are contractually excluded from model training by default under Google’s data processing terms; (2) negotiate a zero-data-retention (ZDR) agreement with the LLM vendor, which deletes inputs and outputs immediately after inference with no logging</w:t>
+      </w:r>
+      <w:r>
+        <w:rPr>
+          <w:sz w:val="24"/>
+          <w:szCs w:val="24"/>
+        </w:rPr>
+        <w:t xml:space="preserve"> (Comcast has this with Google already)</w:t>
+      </w:r>
+      <w:r>
+        <w:rPr>
+          <w:sz w:val="24"/>
+          <w:szCs w:val="24"/>
+        </w:rPr>
+        <w:t>; (3) where neither is available, deploy a self-hosted or on-premises model (Llama 3, Mistral, or a fine-tuned variant) within Comcast’s network perimeter so no data leaves the boundary. For the agent layer, this means replacing the Gemini API endpoint with a Vertex AI or internal endpoint — the ADK agent definitions remain unchanged since the model is configurable per agent.</w:t>
+      </w:r>
+    </w:p>
+    <w:p>
+      <w:pPr>
+        <w:pStyle w:val="ListParagraph"/>
+        <w:numPr>
+          <w:ilvl w:val="0"/>
+          <w:numId w:val="2"/>
+        </w:numPr>
+        <w:spacing w:after="60"/>
+      </w:pPr>
+      <w:r>
+        <w:rPr>
+          <w:b/>
+          <w:bCs/>
+          <w:sz w:val="24"/>
+          <w:szCs w:val="24"/>
+        </w:rPr>
+        <w:t>PII minimization in the prompt layer.</w:t>
+      </w:r>
+      <w:r>
+        <w:rPr>
+          <w:sz w:val="24"/>
+          <w:szCs w:val="24"/>
+        </w:rPr>
+        <w:t xml:space="preserve"> Our architecture already has a structural advantage here: critical data (addresses, order IDs, prices, payment tokens) flows through deterministic tool calls and returns as structured JSON — it is never constructed inside a prompt from raw user input. In production we extend this with a PII interception layer that sits between the user input and the agent session: (1) run a lightweight classifier</w:t>
+      </w:r>
+      <w:r>
+        <w:rPr>
+          <w:sz w:val="24"/>
+          <w:szCs w:val="24"/>
+        </w:rPr>
+        <w:t xml:space="preserve"> model</w:t>
+      </w:r>
+      <w:r>
+        <w:rPr>
+          <w:sz w:val="24"/>
+          <w:szCs w:val="24"/>
+        </w:rPr>
+        <w:t xml:space="preserve"> (or regex patterns for structured PII like SSN, credit card, phone) over the raw input before it enters the ADK session; (2) replace detected PII with pseudonymous tokens (e.g., “CONTACT_001”, “ADDRESS_002”) that are stored in a secure vault; (3) agents reason over tokens, not raw PII; (4) de-tokenize only at the final output layer before sending to the customer. This means LLM context windows contain tokens, not real customer data, even if a ZDR agreement is in place as an additional backstop.</w:t>
+      </w:r>
+    </w:p>
+    <w:p>
+      <w:pPr>
+        <w:pStyle w:val="ListParagraph"/>
+        <w:numPr>
+          <w:ilvl w:val="0"/>
+          <w:numId w:val="2"/>
+        </w:numPr>
+        <w:spacing w:after="60"/>
+      </w:pPr>
+      <w:r>
+        <w:rPr>
+          <w:b/>
+          <w:bCs/>
+          <w:sz w:val="24"/>
+          <w:szCs w:val="24"/>
+        </w:rPr>
+        <w:t>Encryption — in transit and at rest.</w:t>
+      </w:r>
+      <w:r>
+        <w:rPr>
+          <w:sz w:val="24"/>
+          <w:szCs w:val="24"/>
+        </w:rPr>
+        <w:t xml:space="preserve"> In transit: all agent-to-LLM API calls and client-to-backend SSE streams use TLS 1.2+ (enforced by Cloud Run and the Gemini/Vertex </w:t>
+      </w:r>
+      <w:r>
+        <w:rPr>
+          <w:sz w:val="24"/>
+          <w:szCs w:val="24"/>
+        </w:rPr>
         <w:lastRenderedPageBreak/>
-        <w:t>PII concerns</w:t>
-      </w:r>
-    </w:p>
-    <w:p>
-      <w:pPr>
-        <w:pStyle w:val="ListParagraph"/>
-        <w:numPr>
-          <w:ilvl w:val="0"/>
-          <w:numId w:val="2"/>
-        </w:numPr>
-        <w:spacing w:after="60"/>
-      </w:pPr>
-      <w:r>
-        <w:rPr>
-          <w:b/>
-          <w:bCs/>
-          <w:sz w:val="24"/>
-          <w:szCs w:val="24"/>
-        </w:rPr>
-        <w:t>What PII does a production deployment handle?</w:t>
-      </w:r>
-      <w:r>
-        <w:rPr>
-          <w:sz w:val="24"/>
-          <w:szCs w:val="24"/>
-        </w:rPr>
-        <w:t xml:space="preserve"> Business name, contact details (name, email, phone), service address, payment authorization data (credit check inputs, payment tokens), and conversation history. In the demo environment, all data is synthetic. In production, each of these categories requires a distinct handling regime.</w:t>
-      </w:r>
-    </w:p>
-    <w:p>
-      <w:pPr>
-        <w:pStyle w:val="ListParagraph"/>
-        <w:numPr>
-          <w:ilvl w:val="0"/>
-          <w:numId w:val="2"/>
-        </w:numPr>
-        <w:spacing w:after="60"/>
-      </w:pPr>
-      <w:r>
-        <w:rPr>
-          <w:b/>
-          <w:bCs/>
-          <w:sz w:val="24"/>
-          <w:szCs w:val="24"/>
-        </w:rPr>
-        <w:t>LLM training opt-out — the most critical concern.</w:t>
-      </w:r>
-      <w:r>
-        <w:rPr>
-          <w:sz w:val="24"/>
-          <w:szCs w:val="24"/>
-        </w:rPr>
-        <w:t xml:space="preserve"> By default, consumer-tier LLM APIs (including Gemini) may use API inputs to improve models. In a production Comcast deployment this is a hard no. Mitigation options in priority order: (1) use Google’s Vertex AI rather than the Gemini Developer API — Vertex AI API calls are contractually excluded from model training by default under Google’s data processing terms; (2) negotiate a zero-data-retention (ZDR) agreement with the LLM vendor, which deletes inputs and outputs immediately after inference with no logging</w:t>
-      </w:r>
-      <w:r>
-        <w:rPr>
-          <w:sz w:val="24"/>
-          <w:szCs w:val="24"/>
-        </w:rPr>
-        <w:t xml:space="preserve"> (Comcast has this with Google already)</w:t>
-      </w:r>
-      <w:r>
-        <w:rPr>
-          <w:sz w:val="24"/>
-          <w:szCs w:val="24"/>
-        </w:rPr>
-        <w:t>; (3) where neither is available, deploy a self-hosted or on-premises model (Llama 3, Mistral, or a fine-tuned variant) within Comcast’s network perimeter so no data leaves the boundary. For the agent layer, this means replacing the Gemini API endpoint with a Vertex AI or internal endpoint — the ADK agent definitions remain unchanged since the model is configurable per agent.</w:t>
-      </w:r>
-    </w:p>
-    <w:p>
-      <w:pPr>
-        <w:pStyle w:val="ListParagraph"/>
-        <w:numPr>
-          <w:ilvl w:val="0"/>
-          <w:numId w:val="2"/>
-        </w:numPr>
-        <w:spacing w:after="60"/>
-      </w:pPr>
-      <w:r>
-        <w:rPr>
-          <w:b/>
-          <w:bCs/>
-          <w:sz w:val="24"/>
-          <w:szCs w:val="24"/>
-        </w:rPr>
-        <w:t>PII minimization in the prompt layer.</w:t>
-      </w:r>
-      <w:r>
-        <w:rPr>
-          <w:sz w:val="24"/>
-          <w:szCs w:val="24"/>
-        </w:rPr>
-        <w:t xml:space="preserve"> Our architecture already has a structural advantage here: critical data (addresses, order IDs, prices, payment tokens) flows through deterministic tool calls and returns as structured JSON — it is never constructed inside a prompt from raw user input. In production we extend this with a PII interception layer that sits between the user input and the agent session: (1) run a lightweight classifier</w:t>
-      </w:r>
-      <w:r>
-        <w:rPr>
-          <w:sz w:val="24"/>
-          <w:szCs w:val="24"/>
-        </w:rPr>
-        <w:t xml:space="preserve"> model</w:t>
-      </w:r>
-      <w:r>
-        <w:rPr>
-          <w:sz w:val="24"/>
-          <w:szCs w:val="24"/>
-        </w:rPr>
-        <w:t xml:space="preserve"> (or regex patterns for structured PII like SSN, credit card, phone) over the raw input before it enters the ADK session; (2) replace detected PII with pseudonymous tokens (e.g., “CONTACT_001”, “ADDRESS_002”) that are stored in a secure vault; (3) agents reason over tokens, not raw PII; (4) de-tokenize only at the final output layer before sending to the customer. This means LLM context windows contain tokens, not real customer data, even if a ZDR agreement is in place as an additional backstop.</w:t>
-      </w:r>
-    </w:p>
-    <w:p>
-      <w:pPr>
-        <w:pStyle w:val="ListParagraph"/>
-        <w:numPr>
-          <w:ilvl w:val="0"/>
-          <w:numId w:val="2"/>
-        </w:numPr>
-        <w:spacing w:after="60"/>
-      </w:pPr>
-      <w:r>
-        <w:rPr>
-          <w:b/>
-          <w:bCs/>
-          <w:sz w:val="24"/>
-          <w:szCs w:val="24"/>
-        </w:rPr>
-        <w:t>Encryption — in transit and at rest.</w:t>
-      </w:r>
-      <w:r>
-        <w:rPr>
-          <w:sz w:val="24"/>
-          <w:szCs w:val="24"/>
-        </w:rPr>
-        <w:t xml:space="preserve"> In transit: all agent-to-LLM API calls and client-to-backend SSE streams use TLS 1.2+ (enforced by Cloud Run and the Gemini/Vertex endpoint). Internal agent-to-agent communication stays in-process via ADK session state — no network hop, no interception surface. At rest: the demo uses SQLite on ephemeral Cloud Run storage; in production this becomes Cloud Spanner or Cloud SQL with CMEK (Customer-Managed Encryption Keys), giving Comcast control over key rotation and revocation independent of Google. GCS-synced conversation logs are encrypted with CMEK buckets. Payment tokens are never stored in the agent database — they reference a PCI-compliant vault (e.g., Comcast’s existing payment tokenization service).</w:t>
+        <w:t>endpoint). Internal agent-to-agent communication stays in-process via ADK session state — no network hop, no interception surface. At rest: the demo uses SQLite on ephemeral Cloud Run storage; in production this becomes Cloud Spanner or Cloud SQL with CMEK (Customer-Managed Encryption Keys), giving Comcast control over key rotation and revocation independent of Google. GCS-synced conversation logs are encrypted with CMEK buckets. Payment tokens are never stored in the agent database — they reference a PCI-compliant vault (e.g., Comcast’s existing payment tokenization service).</w:t>
       </w:r>
     </w:p>
     <w:p>
@@ -1284,15 +1763,7 @@
           <w:sz w:val="24"/>
           <w:szCs w:val="24"/>
         </w:rPr>
-        <w:t xml:space="preserve"> with CMEK), not written to application logs. Conversation transcripts, if retained for audit or quality purposes, are stored in a separately access-controlled log store with a defined retention window (e.g., 90 days) and a documented purge process. CCPA and CPNI regulations are directly </w:t>
-      </w:r>
-      <w:r>
-        <w:rPr>
-          <w:sz w:val="24"/>
-          <w:szCs w:val="24"/>
-        </w:rPr>
-        <w:lastRenderedPageBreak/>
-        <w:t>applicable to Comcast Business conversations — retention policies need legal sign-off, not just engineering defaults.</w:t>
+        <w:t xml:space="preserve"> with CMEK), not written to application logs. Conversation transcripts, if retained for audit or quality purposes, are stored in a separately access-controlled log store with a defined retention window (e.g., 90 days) and a documented purge process. CCPA and CPNI regulations are directly applicable to Comcast Business conversations — retention policies need legal sign-off, not just engineering defaults.</w:t>
       </w:r>
     </w:p>
     <w:p>
@@ -1540,6 +2011,7 @@
           <w:sz w:val="26"/>
           <w:szCs w:val="26"/>
         </w:rPr>
+        <w:lastRenderedPageBreak/>
         <w:t>Architecture</w:t>
       </w:r>
     </w:p>
@@ -1734,7 +2206,6 @@
           <w:sz w:val="24"/>
           <w:szCs w:val="24"/>
         </w:rPr>
-        <w:lastRenderedPageBreak/>
         <w:t>How do agents share state?</w:t>
       </w:r>
       <w:r>
@@ -2129,6 +2600,7 @@
           <w:sz w:val="24"/>
           <w:szCs w:val="24"/>
         </w:rPr>
+        <w:lastRenderedPageBreak/>
         <w:t>What’s the full stack?</w:t>
       </w:r>
       <w:r>
@@ -2281,7 +2753,6 @@
           <w:sz w:val="26"/>
           <w:szCs w:val="26"/>
         </w:rPr>
-        <w:lastRenderedPageBreak/>
         <w:t>Build process &amp; team</w:t>
       </w:r>
     </w:p>
@@ -2677,7 +3148,6 @@
           <w:sz w:val="30"/>
           <w:szCs w:val="30"/>
         </w:rPr>
-        <w:lastRenderedPageBreak/>
         <w:t>The long form recording (which the QR code points to)</w:t>
       </w:r>
     </w:p>
@@ -3641,6 +4111,78 @@
       <w:szCs w:val="20"/>
     </w:rPr>
   </w:style>
+  <w:style w:type="table" w:styleId="GridTable2-Accent3">
+    <w:name w:val="Grid Table 2 Accent 3"/>
+    <w:basedOn w:val="TableNormal"/>
+    <w:uiPriority w:val="47"/>
+    <w:rsid w:val="001B0734"/>
+    <w:tblPr>
+      <w:tblStyleRowBandSize w:val="1"/>
+      <w:tblStyleColBandSize w:val="1"/>
+      <w:tblBorders>
+        <w:top w:val="single" w:sz="2" w:space="0" w:color="47D459" w:themeColor="accent3" w:themeTint="99"/>
+        <w:bottom w:val="single" w:sz="2" w:space="0" w:color="47D459" w:themeColor="accent3" w:themeTint="99"/>
+        <w:insideH w:val="single" w:sz="2" w:space="0" w:color="47D459" w:themeColor="accent3" w:themeTint="99"/>
+        <w:insideV w:val="single" w:sz="2" w:space="0" w:color="47D459" w:themeColor="accent3" w:themeTint="99"/>
+      </w:tblBorders>
+    </w:tblPr>
+    <w:tblStylePr w:type="firstRow">
+      <w:rPr>
+        <w:b/>
+        <w:bCs/>
+      </w:rPr>
+      <w:tblPr/>
+      <w:tcPr>
+        <w:tcBorders>
+          <w:top w:val="nil"/>
+          <w:bottom w:val="single" w:sz="12" w:space="0" w:color="47D459" w:themeColor="accent3" w:themeTint="99"/>
+          <w:insideH w:val="nil"/>
+          <w:insideV w:val="nil"/>
+        </w:tcBorders>
+        <w:shd w:val="clear" w:color="auto" w:fill="FFFFFF" w:themeFill="background1"/>
+      </w:tcPr>
+    </w:tblStylePr>
+    <w:tblStylePr w:type="lastRow">
+      <w:rPr>
+        <w:b/>
+        <w:bCs/>
+      </w:rPr>
+      <w:tblPr/>
+      <w:tcPr>
+        <w:tcBorders>
+          <w:top w:val="double" w:sz="2" w:space="0" w:color="47D459" w:themeColor="accent3" w:themeTint="99"/>
+          <w:bottom w:val="nil"/>
+          <w:insideH w:val="nil"/>
+          <w:insideV w:val="nil"/>
+        </w:tcBorders>
+        <w:shd w:val="clear" w:color="auto" w:fill="FFFFFF" w:themeFill="background1"/>
+      </w:tcPr>
+    </w:tblStylePr>
+    <w:tblStylePr w:type="firstCol">
+      <w:rPr>
+        <w:b/>
+        <w:bCs/>
+      </w:rPr>
+    </w:tblStylePr>
+    <w:tblStylePr w:type="lastCol">
+      <w:rPr>
+        <w:b/>
+        <w:bCs/>
+      </w:rPr>
+    </w:tblStylePr>
+    <w:tblStylePr w:type="band1Vert">
+      <w:tblPr/>
+      <w:tcPr>
+        <w:shd w:val="clear" w:color="auto" w:fill="C1F0C7" w:themeFill="accent3" w:themeFillTint="33"/>
+      </w:tcPr>
+    </w:tblStylePr>
+    <w:tblStylePr w:type="band1Horz">
+      <w:tblPr/>
+      <w:tcPr>
+        <w:shd w:val="clear" w:color="auto" w:fill="C1F0C7" w:themeFill="accent3" w:themeFillTint="33"/>
+      </w:tcPr>
+    </w:tblStylePr>
+  </w:style>
 </w:styles>
 </file>
 

</xml_diff>